<commit_message>
Fix pinyin layout to match WPS first page
Use four people/eight frames and Chinese-plus-pinyin lines from the supplied source template.
</commit_message>
<xml_diff>
--- a/assets/templates/拼音桌签.docx
+++ b/assets/templates/拼音桌签.docx
@@ -130,7 +130,7 @@
                                 <w:sz w:val="130"/>
                                 <w:szCs w:val="130"/>
                               </w:rPr>
-                              <w:t>Pinyin</w:t>
+                              <w:t>Foreign</w:t>
                             </w:r>
                           </w:p>
                         </w:txbxContent>
@@ -180,7 +180,7 @@
                           <w:sz w:val="130"/>
                           <w:szCs w:val="130"/>
                         </w:rPr>
-                        <w:t>Pinyin</w:t>
+                        <w:t>Foreign</w:t>
                       </w:r>
                     </w:p>
                   </w:txbxContent>
@@ -241,7 +241,7 @@
                               <w:bidi w:val="0"/>
                               <w:snapToGrid w:val="false"/>
                               <w:spacing w:lineRule="auto" w:line="720" w:before="0" w:after="0"/>
-                              <w:jc w:val="both"/>
+                              <w:jc w:val="center"/>
                               <w:textAlignment w:val="auto"/>
                               <w:rPr>
                                 <w:rFonts w:ascii="楷体" w:hAnsi="楷体" w:eastAsia="楷体" w:cs="楷体"/>
@@ -259,7 +259,7 @@
                                 <w:sz w:val="130"/>
                                 <w:szCs w:val="130"/>
                               </w:rPr>
-                              <w:t>Pinyin</w:t>
+                              <w:t>Foreign</w:t>
                             </w:r>
                           </w:p>
                         </w:txbxContent>
@@ -291,7 +291,7 @@
                         <w:bidi w:val="0"/>
                         <w:snapToGrid w:val="false"/>
                         <w:spacing w:lineRule="auto" w:line="720" w:before="0" w:after="0"/>
-                        <w:jc w:val="both"/>
+                        <w:jc w:val="center"/>
                         <w:textAlignment w:val="auto"/>
                         <w:rPr>
                           <w:rFonts w:ascii="楷体" w:hAnsi="楷体" w:eastAsia="楷体" w:cs="楷体"/>
@@ -309,7 +309,7 @@
                           <w:sz w:val="130"/>
                           <w:szCs w:val="130"/>
                         </w:rPr>
-                        <w:t>Pinyin</w:t>
+                        <w:t>Foreign</w:t>
                       </w:r>
                     </w:p>
                   </w:txbxContent>
@@ -465,10 +465,10 @@
                               <w:bidi w:val="0"/>
                               <w:snapToGrid w:val="false"/>
                               <w:spacing w:lineRule="auto" w:line="720" w:before="0" w:after="0"/>
-                              <w:jc w:val="both"/>
+                              <w:jc w:val="center"/>
                               <w:textAlignment w:val="auto"/>
                               <w:rPr>
-                                <w:rFonts w:ascii="楷体" w:hAnsi="楷体" w:eastAsia="楷体" w:cs="楷体" w:hint="eastAsia"/>
+                                <w:rFonts w:ascii="楷体" w:hAnsi="楷体" w:eastAsia="楷体" w:cs="楷体"/>
                                 <w:b/>
                                 <w:bCs/>
                                 <w:sz w:val="130"/>
@@ -477,13 +477,13 @@
                             </w:pPr>
                             <w:r>
                               <w:rPr>
-                                <w:rFonts w:eastAsia="楷体" w:cs="楷体" w:hint="eastAsia" w:ascii="楷体" w:hAnsi="楷体"/>
+                                <w:rFonts w:eastAsia="楷体" w:cs="楷体" w:ascii="楷体" w:hAnsi="楷体"/>
                                 <w:b/>
                                 <w:bCs/>
                                 <w:sz w:val="130"/>
                                 <w:szCs w:val="130"/>
                               </w:rPr>
-                              <w:t>Sample</w:t>
+                              <w:t>Guest</w:t>
                             </w:r>
                           </w:p>
                         </w:txbxContent>
@@ -515,10 +515,10 @@
                         <w:bidi w:val="0"/>
                         <w:snapToGrid w:val="false"/>
                         <w:spacing w:lineRule="auto" w:line="720" w:before="0" w:after="0"/>
-                        <w:jc w:val="both"/>
+                        <w:jc w:val="center"/>
                         <w:textAlignment w:val="auto"/>
                         <w:rPr>
-                          <w:rFonts w:ascii="楷体" w:hAnsi="楷体" w:eastAsia="楷体" w:cs="楷体" w:hint="eastAsia"/>
+                          <w:rFonts w:ascii="楷体" w:hAnsi="楷体" w:eastAsia="楷体" w:cs="楷体"/>
                           <w:b/>
                           <w:bCs/>
                           <w:sz w:val="130"/>
@@ -527,13 +527,13 @@
                       </w:pPr>
                       <w:r>
                         <w:rPr>
-                          <w:rFonts w:eastAsia="楷体" w:cs="楷体" w:hint="eastAsia" w:ascii="楷体" w:hAnsi="楷体"/>
+                          <w:rFonts w:eastAsia="楷体" w:cs="楷体" w:ascii="楷体" w:hAnsi="楷体"/>
                           <w:b/>
                           <w:bCs/>
                           <w:sz w:val="130"/>
                           <w:szCs w:val="130"/>
                         </w:rPr>
-                        <w:t>Sample</w:t>
+                        <w:t>Guest</w:t>
                       </w:r>
                     </w:p>
                   </w:txbxContent>
@@ -594,7 +594,7 @@
                               <w:bidi w:val="0"/>
                               <w:snapToGrid w:val="false"/>
                               <w:spacing w:lineRule="auto" w:line="720" w:before="0" w:after="0"/>
-                              <w:jc w:val="both"/>
+                              <w:jc w:val="center"/>
                               <w:textAlignment w:val="auto"/>
                               <w:rPr>
                                 <w:rFonts w:ascii="楷体" w:hAnsi="楷体" w:eastAsia="楷体" w:cs="楷体"/>
@@ -612,40 +612,7 @@
                                 <w:sz w:val="130"/>
                                 <w:szCs w:val="130"/>
                               </w:rPr>
-                              <w:t>Sample</w:t>
-                            </w:r>
-                          </w:p>
-                          <w:p>
-                            <w:pPr>
-                              <w:pStyle w:val="Normal"/>
-                              <w:keepNext w:val="false"/>
-                              <w:keepLines w:val="false"/>
-                              <w:pageBreakBefore w:val="false"/>
-                              <w:widowControl w:val="false"/>
-                              <w:kinsoku w:val="true"/>
-                              <w:overflowPunct w:val="true"/>
-                              <w:autoSpaceDE w:val="true"/>
-                              <w:bidi w:val="0"/>
-                              <w:snapToGrid w:val="false"/>
-                              <w:spacing w:lineRule="auto" w:line="720" w:before="0" w:after="0"/>
-                              <w:jc w:val="both"/>
-                              <w:textAlignment w:val="auto"/>
-                              <w:rPr>
-                                <w:rFonts w:ascii="楷体" w:hAnsi="楷体" w:eastAsia="楷体" w:cs="楷体"/>
-                                <w:b/>
-                                <w:bCs/>
-                                <w:sz w:val="130"/>
-                                <w:szCs w:val="130"/>
-                              </w:rPr>
-                            </w:pPr>
-                            <w:r>
-                              <w:rPr>
-                                <w:rFonts w:eastAsia="楷体" w:cs="楷体" w:ascii="楷体" w:hAnsi="楷体"/>
-                                <w:b/>
-                                <w:bCs/>
-                                <w:sz w:val="130"/>
-                                <w:szCs w:val="130"/>
-                              </w:rPr>
+                              <w:t>Guest</w:t>
                             </w:r>
                           </w:p>
                         </w:txbxContent>
@@ -677,7 +644,7 @@
                         <w:bidi w:val="0"/>
                         <w:snapToGrid w:val="false"/>
                         <w:spacing w:lineRule="auto" w:line="720" w:before="0" w:after="0"/>
-                        <w:jc w:val="both"/>
+                        <w:jc w:val="center"/>
                         <w:textAlignment w:val="auto"/>
                         <w:rPr>
                           <w:rFonts w:ascii="楷体" w:hAnsi="楷体" w:eastAsia="楷体" w:cs="楷体"/>
@@ -695,7 +662,253 @@
                           <w:sz w:val="130"/>
                           <w:szCs w:val="130"/>
                         </w:rPr>
-                        <w:t>Sample</w:t>
+                        <w:t>Guest</w:t>
+                      </w:r>
+                    </w:p>
+                  </w:txbxContent>
+                </v:textbox>
+                <w10:wrap type="none"/>
+              </v:rect>
+            </w:pict>
+          </mc:Fallback>
+        </mc:AlternateContent>
+      </w:r>
+    </w:p>
+    <w:p>
+      <w:pPr>
+        <w:pStyle w:val="Normal"/>
+        <w:rPr/>
+      </w:pPr>
+      <w:r>
+        <w:rPr/>
+      </w:r>
+    </w:p>
+    <w:p>
+      <w:pPr>
+        <w:pStyle w:val="Normal"/>
+        <w:rPr/>
+      </w:pPr>
+      <w:r>
+        <w:rPr/>
+      </w:r>
+    </w:p>
+    <w:p>
+      <w:pPr>
+        <w:pStyle w:val="Normal"/>
+        <w:rPr/>
+      </w:pPr>
+      <w:r>
+        <w:rPr/>
+      </w:r>
+    </w:p>
+    <w:p>
+      <w:pPr>
+        <w:pStyle w:val="Normal"/>
+        <w:rPr/>
+      </w:pPr>
+      <w:r>
+        <w:rPr/>
+      </w:r>
+    </w:p>
+    <w:p>
+      <w:pPr>
+        <w:pStyle w:val="Normal"/>
+        <w:rPr/>
+      </w:pPr>
+      <w:r>
+        <w:rPr/>
+      </w:r>
+    </w:p>
+    <w:p>
+      <w:pPr>
+        <w:pStyle w:val="Normal"/>
+        <w:rPr/>
+      </w:pPr>
+      <w:r>
+        <w:rPr/>
+      </w:r>
+    </w:p>
+    <w:p>
+      <w:pPr>
+        <w:pStyle w:val="Normal"/>
+        <w:rPr/>
+      </w:pPr>
+      <w:r>
+        <w:rPr/>
+      </w:r>
+    </w:p>
+    <w:p>
+      <w:pPr>
+        <w:pStyle w:val="Normal"/>
+        <w:rPr/>
+      </w:pPr>
+      <w:r>
+        <w:rPr/>
+      </w:r>
+    </w:p>
+    <w:p>
+      <w:pPr>
+        <w:pStyle w:val="Normal"/>
+        <w:rPr/>
+      </w:pPr>
+      <w:r>
+        <w:rPr/>
+      </w:r>
+    </w:p>
+    <w:p>
+      <w:pPr>
+        <w:pStyle w:val="Normal"/>
+        <w:rPr/>
+      </w:pPr>
+      <w:r>
+        <w:rPr/>
+      </w:r>
+    </w:p>
+    <w:p>
+      <w:pPr>
+        <w:pStyle w:val="Normal"/>
+        <w:rPr/>
+      </w:pPr>
+      <w:r>
+        <w:rPr/>
+      </w:r>
+      <w:r>
+        <mc:AlternateContent>
+          <mc:Choice Requires="wps">
+            <w:drawing>
+              <wp:anchor distT="0" distB="0" distL="114935" distR="114935" simplePos="0" relativeHeight="4" behindDoc="0" locked="0" layoutInCell="1" allowOverlap="1">
+                <wp:simplePos x="0" y="0"/>
+                <wp:positionH relativeFrom="column">
+                  <wp:posOffset>-471170</wp:posOffset>
+                </wp:positionH>
+                <wp:positionV relativeFrom="paragraph">
+                  <wp:posOffset>12700</wp:posOffset>
+                </wp:positionV>
+                <wp:extent cx="3209290" cy="1856740"/>
+                <wp:effectExtent l="0" t="0" r="0" b="0"/>
+                <wp:wrapNone/>
+                <wp:docPr id="5" name="Frame6"/>
+                <a:graphic xmlns:a="http://schemas.openxmlformats.org/drawingml/2006/main">
+                  <a:graphicData uri="http://schemas.microsoft.com/office/word/2010/wordprocessingShape">
+                    <wps:wsp>
+                      <wps:cNvSpPr txBox="1"/>
+                      <wps:spPr>
+                        <a:xfrm>
+                          <a:off x="0" y="0"/>
+                          <a:ext cx="3209290" cy="1856740"/>
+                        </a:xfrm>
+                        <a:prstGeom prst="rect"/>
+                        <a:solidFill>
+                          <a:srgbClr val="FFFFFF"/>
+                        </a:solidFill>
+                        <a:ln w="9525">
+                          <a:solidFill>
+                            <a:srgbClr val="000000"/>
+                          </a:solidFill>
+                        </a:ln>
+                      </wps:spPr>
+                      <wps:txbx>
+                        <w:txbxContent>
+                          <w:p>
+                            <w:pPr>
+                              <w:pStyle w:val="Normal"/>
+                              <w:keepNext w:val="false"/>
+                              <w:keepLines w:val="false"/>
+                              <w:pageBreakBefore w:val="false"/>
+                              <w:widowControl w:val="false"/>
+                              <w:kinsoku w:val="true"/>
+                              <w:overflowPunct w:val="true"/>
+                              <w:autoSpaceDE w:val="true"/>
+                              <w:bidi w:val="0"/>
+                              <w:snapToGrid w:val="false"/>
+                              <w:spacing w:lineRule="atLeast" w:line="0" w:before="0" w:after="0"/>
+                              <w:jc w:val="center"/>
+                              <w:textAlignment w:val="auto"/>
+                              <w:rPr>
+                                <w:rFonts w:ascii="楷体" w:hAnsi="楷体" w:eastAsia="楷体" w:cs="楷体"/>
+                                <w:sz w:val="112"/>
+                                <w:szCs w:val="112"/>
+                              </w:rPr>
+                            </w:pPr>
+                            <w:r>
+                              <w:rPr>
+                                <w:rFonts w:ascii="楷体" w:hAnsi="楷体" w:cs="楷体" w:eastAsia="楷体"/>
+                                <w:sz w:val="112"/>
+                                <w:szCs w:val="112"/>
+                              </w:rPr>
+                              <w:t xml:space="preserve">张  三</w:t>
+                            </w:r>
+                          </w:p>
+                          <w:p>
+                            <w:pPr>
+                              <w:pStyle w:val="Normal"/>
+                              <w:keepNext w:val="false"/>
+                              <w:keepLines w:val="false"/>
+                              <w:pageBreakBefore w:val="false"/>
+                              <w:widowControl w:val="false"/>
+                              <w:kinsoku w:val="true"/>
+                              <w:overflowPunct w:val="true"/>
+                              <w:autoSpaceDE w:val="true"/>
+                              <w:bidi w:val="0"/>
+                              <w:snapToGrid w:val="false"/>
+                              <w:spacing w:lineRule="atLeast" w:line="0" w:before="0" w:after="0"/>
+                              <w:jc w:val="center"/>
+                              <w:textAlignment w:val="auto"/>
+                              <w:rPr/>
+                            </w:pPr>
+                            <w:r>
+                              <w:rPr>
+                                <w:rFonts w:eastAsia="楷体" w:cs="楷体" w:hint="eastAsia" w:ascii="楷体" w:hAnsi="楷体"/>
+                                <w:sz w:val="72"/>
+                                <w:szCs w:val="72"/>
+                              </w:rPr>
+                              <w:t xml:space="preserve">Zhang  San</w:t>
+                            </w:r>
+                          </w:p>
+                        </w:txbxContent>
+                      </wps:txbx>
+                      <wps:bodyPr anchor="t" lIns="91440" tIns="45720" rIns="91440" bIns="45720">
+                        <a:noAutofit/>
+                      </wps:bodyPr>
+                    </wps:wsp>
+                  </a:graphicData>
+                </a:graphic>
+              </wp:anchor>
+            </w:drawing>
+          </mc:Choice>
+          <mc:Fallback>
+            <w:pict>
+              <v:rect fillcolor="#FFFFFF" strokecolor="#000000" strokeweight="0pt" style="position:absolute;rotation:-0;width:252.7pt;height:146.2pt;mso-wrap-distance-left:9.05pt;mso-wrap-distance-right:9.05pt;mso-wrap-distance-top:0pt;mso-wrap-distance-bottom:0pt;margin-top:1pt;mso-position-vertical-relative:text;margin-left:-37.1pt;mso-position-horizontal-relative:text">
+                <v:textbox>
+                  <w:txbxContent>
+                    <w:p>
+                      <w:pPr>
+                        <w:pStyle w:val="Normal"/>
+                        <w:keepNext w:val="false"/>
+                        <w:keepLines w:val="false"/>
+                        <w:pageBreakBefore w:val="false"/>
+                        <w:widowControl w:val="false"/>
+                        <w:kinsoku w:val="true"/>
+                        <w:overflowPunct w:val="true"/>
+                        <w:autoSpaceDE w:val="true"/>
+                        <w:bidi w:val="0"/>
+                        <w:snapToGrid w:val="false"/>
+                        <w:spacing w:lineRule="atLeast" w:line="0" w:before="0" w:after="0"/>
+                        <w:jc w:val="center"/>
+                        <w:textAlignment w:val="auto"/>
+                        <w:rPr>
+                          <w:rFonts w:ascii="楷体" w:hAnsi="楷体" w:eastAsia="楷体" w:cs="楷体"/>
+                          <w:sz w:val="112"/>
+                          <w:szCs w:val="112"/>
+                        </w:rPr>
+                      </w:pPr>
+                      <w:r>
+                        <w:rPr>
+                          <w:rFonts w:ascii="楷体" w:hAnsi="楷体" w:cs="楷体" w:eastAsia="楷体"/>
+                          <w:sz w:val="112"/>
+                          <w:szCs w:val="112"/>
+                        </w:rPr>
+                        <w:t xml:space="preserve">张  三</w:t>
                       </w:r>
                     </w:p>
                     <w:p>
@@ -710,25 +923,643 @@
                         <w:autoSpaceDE w:val="true"/>
                         <w:bidi w:val="0"/>
                         <w:snapToGrid w:val="false"/>
-                        <w:spacing w:lineRule="auto" w:line="720" w:before="0" w:after="0"/>
-                        <w:jc w:val="both"/>
+                        <w:spacing w:lineRule="atLeast" w:line="0" w:before="0" w:after="0"/>
+                        <w:jc w:val="center"/>
                         <w:textAlignment w:val="auto"/>
-                        <w:rPr>
-                          <w:rFonts w:ascii="楷体" w:hAnsi="楷体" w:eastAsia="楷体" w:cs="楷体"/>
-                          <w:b/>
-                          <w:bCs/>
-                          <w:sz w:val="130"/>
-                          <w:szCs w:val="130"/>
-                        </w:rPr>
+                        <w:rPr/>
                       </w:pPr>
                       <w:r>
                         <w:rPr>
-                          <w:rFonts w:eastAsia="楷体" w:cs="楷体" w:ascii="楷体" w:hAnsi="楷体"/>
-                          <w:b/>
-                          <w:bCs/>
-                          <w:sz w:val="130"/>
-                          <w:szCs w:val="130"/>
-                        </w:rPr>
+                          <w:rFonts w:eastAsia="楷体" w:cs="楷体" w:hint="eastAsia" w:ascii="楷体" w:hAnsi="楷体"/>
+                          <w:sz w:val="72"/>
+                          <w:szCs w:val="72"/>
+                        </w:rPr>
+                        <w:t xml:space="preserve">Zhang  San</w:t>
+                      </w:r>
+                    </w:p>
+                  </w:txbxContent>
+                </v:textbox>
+                <w10:wrap type="none"/>
+              </v:rect>
+            </w:pict>
+          </mc:Fallback>
+        </mc:AlternateContent>
+      </w:r>
+      <w:r>
+        <mc:AlternateContent>
+          <mc:Choice Requires="wps">
+            <w:drawing>
+              <wp:anchor distT="0" distB="0" distL="114935" distR="114935" simplePos="0" relativeHeight="13" behindDoc="0" locked="0" layoutInCell="1" allowOverlap="1">
+                <wp:simplePos x="0" y="0"/>
+                <wp:positionH relativeFrom="column">
+                  <wp:posOffset>2834005</wp:posOffset>
+                </wp:positionH>
+                <wp:positionV relativeFrom="paragraph">
+                  <wp:posOffset>3175</wp:posOffset>
+                </wp:positionV>
+                <wp:extent cx="3209290" cy="1856740"/>
+                <wp:effectExtent l="0" t="0" r="0" b="0"/>
+                <wp:wrapNone/>
+                <wp:docPr id="6" name="Frame5"/>
+                <a:graphic xmlns:a="http://schemas.openxmlformats.org/drawingml/2006/main">
+                  <a:graphicData uri="http://schemas.microsoft.com/office/word/2010/wordprocessingShape">
+                    <wps:wsp>
+                      <wps:cNvSpPr txBox="1"/>
+                      <wps:spPr>
+                        <a:xfrm>
+                          <a:off x="0" y="0"/>
+                          <a:ext cx="3209290" cy="1856740"/>
+                        </a:xfrm>
+                        <a:prstGeom prst="rect"/>
+                        <a:solidFill>
+                          <a:srgbClr val="FFFFFF"/>
+                        </a:solidFill>
+                        <a:ln w="9525">
+                          <a:solidFill>
+                            <a:srgbClr val="000000"/>
+                          </a:solidFill>
+                        </a:ln>
+                      </wps:spPr>
+                      <wps:txbx>
+                        <w:txbxContent>
+                          <w:p>
+                            <w:pPr>
+                              <w:pStyle w:val="Normal"/>
+                              <w:keepNext w:val="false"/>
+                              <w:keepLines w:val="false"/>
+                              <w:pageBreakBefore w:val="false"/>
+                              <w:widowControl w:val="false"/>
+                              <w:kinsoku w:val="true"/>
+                              <w:overflowPunct w:val="true"/>
+                              <w:autoSpaceDE w:val="true"/>
+                              <w:bidi w:val="0"/>
+                              <w:snapToGrid w:val="false"/>
+                              <w:spacing w:lineRule="atLeast" w:line="0" w:before="0" w:after="0"/>
+                              <w:jc w:val="center"/>
+                              <w:textAlignment w:val="auto"/>
+                              <w:rPr>
+                                <w:rFonts w:ascii="楷体" w:hAnsi="楷体" w:eastAsia="楷体" w:cs="楷体"/>
+                                <w:sz w:val="112"/>
+                                <w:szCs w:val="112"/>
+                              </w:rPr>
+                            </w:pPr>
+                            <w:r>
+                              <w:rPr>
+                                <w:rFonts w:ascii="楷体" w:hAnsi="楷体" w:cs="楷体" w:eastAsia="楷体"/>
+                                <w:sz w:val="112"/>
+                                <w:szCs w:val="112"/>
+                              </w:rPr>
+                              <w:t xml:space="preserve">张  三</w:t>
+                            </w:r>
+                          </w:p>
+                          <w:p>
+                            <w:pPr>
+                              <w:pStyle w:val="Normal"/>
+                              <w:keepNext w:val="false"/>
+                              <w:keepLines w:val="false"/>
+                              <w:pageBreakBefore w:val="false"/>
+                              <w:widowControl w:val="false"/>
+                              <w:kinsoku w:val="true"/>
+                              <w:overflowPunct w:val="true"/>
+                              <w:autoSpaceDE w:val="true"/>
+                              <w:bidi w:val="0"/>
+                              <w:snapToGrid w:val="false"/>
+                              <w:spacing w:lineRule="atLeast" w:line="0" w:before="0" w:after="0"/>
+                              <w:jc w:val="center"/>
+                              <w:textAlignment w:val="auto"/>
+                              <w:rPr/>
+                            </w:pPr>
+                            <w:r>
+                              <w:rPr>
+                                <w:rFonts w:eastAsia="楷体" w:cs="楷体" w:hint="eastAsia" w:ascii="楷体" w:hAnsi="楷体"/>
+                                <w:sz w:val="72"/>
+                                <w:szCs w:val="72"/>
+                              </w:rPr>
+                              <w:t xml:space="preserve">Zhang  San</w:t>
+                            </w:r>
+                          </w:p>
+                        </w:txbxContent>
+                      </wps:txbx>
+                      <wps:bodyPr anchor="t" lIns="91440" tIns="45720" rIns="91440" bIns="45720">
+                        <a:noAutofit/>
+                      </wps:bodyPr>
+                    </wps:wsp>
+                  </a:graphicData>
+                </a:graphic>
+              </wp:anchor>
+            </w:drawing>
+          </mc:Choice>
+          <mc:Fallback>
+            <w:pict>
+              <v:rect fillcolor="#FFFFFF" strokecolor="#000000" strokeweight="0pt" style="position:absolute;rotation:-0;width:252.7pt;height:146.2pt;mso-wrap-distance-left:9.05pt;mso-wrap-distance-right:9.05pt;mso-wrap-distance-top:0pt;mso-wrap-distance-bottom:0pt;margin-top:0.25pt;mso-position-vertical-relative:text;margin-left:223.15pt;mso-position-horizontal-relative:text">
+                <v:textbox>
+                  <w:txbxContent>
+                    <w:p>
+                      <w:pPr>
+                        <w:pStyle w:val="Normal"/>
+                        <w:keepNext w:val="false"/>
+                        <w:keepLines w:val="false"/>
+                        <w:pageBreakBefore w:val="false"/>
+                        <w:widowControl w:val="false"/>
+                        <w:kinsoku w:val="true"/>
+                        <w:overflowPunct w:val="true"/>
+                        <w:autoSpaceDE w:val="true"/>
+                        <w:bidi w:val="0"/>
+                        <w:snapToGrid w:val="false"/>
+                        <w:spacing w:lineRule="atLeast" w:line="0" w:before="0" w:after="0"/>
+                        <w:jc w:val="center"/>
+                        <w:textAlignment w:val="auto"/>
+                        <w:rPr>
+                          <w:rFonts w:ascii="楷体" w:hAnsi="楷体" w:eastAsia="楷体" w:cs="楷体"/>
+                          <w:sz w:val="112"/>
+                          <w:szCs w:val="112"/>
+                        </w:rPr>
+                      </w:pPr>
+                      <w:r>
+                        <w:rPr>
+                          <w:rFonts w:ascii="楷体" w:hAnsi="楷体" w:cs="楷体" w:eastAsia="楷体"/>
+                          <w:sz w:val="112"/>
+                          <w:szCs w:val="112"/>
+                        </w:rPr>
+                        <w:t xml:space="preserve">张  三</w:t>
+                      </w:r>
+                    </w:p>
+                    <w:p>
+                      <w:pPr>
+                        <w:pStyle w:val="Normal"/>
+                        <w:keepNext w:val="false"/>
+                        <w:keepLines w:val="false"/>
+                        <w:pageBreakBefore w:val="false"/>
+                        <w:widowControl w:val="false"/>
+                        <w:kinsoku w:val="true"/>
+                        <w:overflowPunct w:val="true"/>
+                        <w:autoSpaceDE w:val="true"/>
+                        <w:bidi w:val="0"/>
+                        <w:snapToGrid w:val="false"/>
+                        <w:spacing w:lineRule="atLeast" w:line="0" w:before="0" w:after="0"/>
+                        <w:jc w:val="center"/>
+                        <w:textAlignment w:val="auto"/>
+                        <w:rPr/>
+                      </w:pPr>
+                      <w:r>
+                        <w:rPr>
+                          <w:rFonts w:eastAsia="楷体" w:cs="楷体" w:hint="eastAsia" w:ascii="楷体" w:hAnsi="楷体"/>
+                          <w:sz w:val="72"/>
+                          <w:szCs w:val="72"/>
+                        </w:rPr>
+                        <w:t xml:space="preserve">Zhang  San</w:t>
+                      </w:r>
+                    </w:p>
+                  </w:txbxContent>
+                </v:textbox>
+                <w10:wrap type="none"/>
+              </v:rect>
+            </w:pict>
+          </mc:Fallback>
+        </mc:AlternateContent>
+      </w:r>
+    </w:p>
+    <w:p>
+      <w:pPr>
+        <w:pStyle w:val="Normal"/>
+        <w:rPr/>
+      </w:pPr>
+      <w:r>
+        <w:rPr/>
+      </w:r>
+    </w:p>
+    <w:p>
+      <w:pPr>
+        <w:pStyle w:val="Normal"/>
+        <w:rPr/>
+      </w:pPr>
+      <w:r>
+        <w:rPr/>
+      </w:r>
+    </w:p>
+    <w:p>
+      <w:pPr>
+        <w:pStyle w:val="Normal"/>
+        <w:rPr/>
+      </w:pPr>
+      <w:r>
+        <w:rPr/>
+      </w:r>
+    </w:p>
+    <w:p>
+      <w:pPr>
+        <w:pStyle w:val="Normal"/>
+        <w:rPr/>
+      </w:pPr>
+      <w:r>
+        <w:rPr/>
+      </w:r>
+    </w:p>
+    <w:p>
+      <w:pPr>
+        <w:pStyle w:val="Normal"/>
+        <w:rPr/>
+      </w:pPr>
+      <w:r>
+        <w:rPr/>
+      </w:r>
+    </w:p>
+    <w:p>
+      <w:pPr>
+        <w:pStyle w:val="Normal"/>
+        <w:rPr/>
+      </w:pPr>
+      <w:r>
+        <w:rPr/>
+      </w:r>
+    </w:p>
+    <w:p>
+      <w:pPr>
+        <w:pStyle w:val="Normal"/>
+        <w:rPr>
+          <w:rFonts w:hint="eastAsia"/>
+        </w:rPr>
+      </w:pPr>
+      <w:r>
+        <w:rPr>
+          <w:rFonts w:hint="eastAsia"/>
+        </w:rPr>
+      </w:r>
+    </w:p>
+    <w:p>
+      <w:pPr>
+        <w:pStyle w:val="Normal"/>
+        <w:rPr>
+          <w:rFonts w:hint="eastAsia"/>
+        </w:rPr>
+      </w:pPr>
+      <w:r>
+        <w:rPr>
+          <w:rFonts w:hint="eastAsia"/>
+        </w:rPr>
+      </w:r>
+    </w:p>
+    <w:p>
+      <w:pPr>
+        <w:pStyle w:val="Normal"/>
+        <w:rPr>
+          <w:rFonts w:hint="eastAsia"/>
+        </w:rPr>
+      </w:pPr>
+      <w:r>
+        <w:rPr>
+          <w:rFonts w:hint="eastAsia"/>
+        </w:rPr>
+      </w:r>
+    </w:p>
+    <w:p>
+      <w:pPr>
+        <w:pStyle w:val="Normal"/>
+        <w:rPr>
+          <w:rFonts w:hint="eastAsia"/>
+        </w:rPr>
+      </w:pPr>
+      <w:r>
+        <w:rPr>
+          <w:rFonts w:hint="eastAsia"/>
+        </w:rPr>
+      </w:r>
+      <w:r>
+        <mc:AlternateContent>
+          <mc:Choice Requires="wps">
+            <w:drawing>
+              <wp:anchor distT="0" distB="0" distL="114935" distR="114935" simplePos="0" relativeHeight="9" behindDoc="0" locked="0" layoutInCell="1" allowOverlap="1">
+                <wp:simplePos x="0" y="0"/>
+                <wp:positionH relativeFrom="column">
+                  <wp:posOffset>2843530</wp:posOffset>
+                </wp:positionH>
+                <wp:positionV relativeFrom="paragraph">
+                  <wp:posOffset>22225</wp:posOffset>
+                </wp:positionV>
+                <wp:extent cx="3209290" cy="1856740"/>
+                <wp:effectExtent l="0" t="0" r="0" b="0"/>
+                <wp:wrapNone/>
+                <wp:docPr id="7" name="Frame7"/>
+                <a:graphic xmlns:a="http://schemas.openxmlformats.org/drawingml/2006/main">
+                  <a:graphicData uri="http://schemas.microsoft.com/office/word/2010/wordprocessingShape">
+                    <wps:wsp>
+                      <wps:cNvSpPr txBox="1"/>
+                      <wps:spPr>
+                        <a:xfrm>
+                          <a:off x="0" y="0"/>
+                          <a:ext cx="3209290" cy="1856740"/>
+                        </a:xfrm>
+                        <a:prstGeom prst="rect"/>
+                        <a:solidFill>
+                          <a:srgbClr val="FFFFFF"/>
+                        </a:solidFill>
+                        <a:ln w="9525">
+                          <a:solidFill>
+                            <a:srgbClr val="000000"/>
+                          </a:solidFill>
+                        </a:ln>
+                      </wps:spPr>
+                      <wps:txbx>
+                        <w:txbxContent>
+                          <w:p>
+                            <w:pPr>
+                              <w:pStyle w:val="Normal"/>
+                              <w:keepNext w:val="false"/>
+                              <w:keepLines w:val="false"/>
+                              <w:pageBreakBefore w:val="false"/>
+                              <w:widowControl w:val="false"/>
+                              <w:kinsoku w:val="true"/>
+                              <w:overflowPunct w:val="true"/>
+                              <w:autoSpaceDE w:val="true"/>
+                              <w:bidi w:val="0"/>
+                              <w:snapToGrid w:val="false"/>
+                              <w:spacing w:lineRule="atLeast" w:line="0" w:before="0" w:after="0"/>
+                              <w:jc w:val="center"/>
+                              <w:textAlignment w:val="auto"/>
+                              <w:rPr>
+                                <w:rFonts w:ascii="楷体" w:hAnsi="楷体" w:eastAsia="楷体" w:cs="楷体"/>
+                                <w:sz w:val="112"/>
+                                <w:szCs w:val="112"/>
+                              </w:rPr>
+                            </w:pPr>
+                            <w:r>
+                              <w:rPr>
+                                <w:rFonts w:ascii="楷体" w:hAnsi="楷体" w:cs="楷体" w:eastAsia="楷体"/>
+                                <w:sz w:val="112"/>
+                                <w:szCs w:val="112"/>
+                              </w:rPr>
+                              <w:t>李佳琦</w:t>
+                            </w:r>
+                          </w:p>
+                          <w:p>
+                            <w:pPr>
+                              <w:pStyle w:val="Normal"/>
+                              <w:keepNext w:val="false"/>
+                              <w:keepLines w:val="false"/>
+                              <w:pageBreakBefore w:val="false"/>
+                              <w:widowControl w:val="false"/>
+                              <w:kinsoku w:val="true"/>
+                              <w:overflowPunct w:val="true"/>
+                              <w:autoSpaceDE w:val="true"/>
+                              <w:bidi w:val="0"/>
+                              <w:snapToGrid w:val="false"/>
+                              <w:spacing w:lineRule="atLeast" w:line="0" w:before="0" w:after="0"/>
+                              <w:jc w:val="center"/>
+                              <w:textAlignment w:val="auto"/>
+                              <w:rPr/>
+                            </w:pPr>
+                            <w:r>
+                              <w:rPr>
+                                <w:rFonts w:eastAsia="楷体" w:cs="楷体" w:hint="eastAsia" w:ascii="楷体" w:hAnsi="楷体"/>
+                                <w:sz w:val="72"/>
+                                <w:szCs w:val="72"/>
+                              </w:rPr>
+                              <w:t>Li Jiaqi</w:t>
+                            </w:r>
+                          </w:p>
+                        </w:txbxContent>
+                      </wps:txbx>
+                      <wps:bodyPr anchor="t" lIns="91440" tIns="45720" rIns="91440" bIns="45720">
+                        <a:noAutofit/>
+                      </wps:bodyPr>
+                    </wps:wsp>
+                  </a:graphicData>
+                </a:graphic>
+              </wp:anchor>
+            </w:drawing>
+          </mc:Choice>
+          <mc:Fallback>
+            <w:pict>
+              <v:rect fillcolor="#FFFFFF" strokecolor="#000000" strokeweight="0pt" style="position:absolute;rotation:-0;width:252.7pt;height:146.2pt;mso-wrap-distance-left:9.05pt;mso-wrap-distance-right:9.05pt;mso-wrap-distance-top:0pt;mso-wrap-distance-bottom:0pt;margin-top:1.75pt;mso-position-vertical-relative:text;margin-left:223.9pt;mso-position-horizontal-relative:text">
+                <v:textbox>
+                  <w:txbxContent>
+                    <w:p>
+                      <w:pPr>
+                        <w:pStyle w:val="Normal"/>
+                        <w:keepNext w:val="false"/>
+                        <w:keepLines w:val="false"/>
+                        <w:pageBreakBefore w:val="false"/>
+                        <w:widowControl w:val="false"/>
+                        <w:kinsoku w:val="true"/>
+                        <w:overflowPunct w:val="true"/>
+                        <w:autoSpaceDE w:val="true"/>
+                        <w:bidi w:val="0"/>
+                        <w:snapToGrid w:val="false"/>
+                        <w:spacing w:lineRule="atLeast" w:line="0" w:before="0" w:after="0"/>
+                        <w:jc w:val="center"/>
+                        <w:textAlignment w:val="auto"/>
+                        <w:rPr>
+                          <w:rFonts w:ascii="楷体" w:hAnsi="楷体" w:eastAsia="楷体" w:cs="楷体"/>
+                          <w:sz w:val="112"/>
+                          <w:szCs w:val="112"/>
+                        </w:rPr>
+                      </w:pPr>
+                      <w:r>
+                        <w:rPr>
+                          <w:rFonts w:ascii="楷体" w:hAnsi="楷体" w:cs="楷体" w:eastAsia="楷体"/>
+                          <w:sz w:val="112"/>
+                          <w:szCs w:val="112"/>
+                        </w:rPr>
+                        <w:t>李佳琦</w:t>
+                      </w:r>
+                    </w:p>
+                    <w:p>
+                      <w:pPr>
+                        <w:pStyle w:val="Normal"/>
+                        <w:keepNext w:val="false"/>
+                        <w:keepLines w:val="false"/>
+                        <w:pageBreakBefore w:val="false"/>
+                        <w:widowControl w:val="false"/>
+                        <w:kinsoku w:val="true"/>
+                        <w:overflowPunct w:val="true"/>
+                        <w:autoSpaceDE w:val="true"/>
+                        <w:bidi w:val="0"/>
+                        <w:snapToGrid w:val="false"/>
+                        <w:spacing w:lineRule="atLeast" w:line="0" w:before="0" w:after="0"/>
+                        <w:jc w:val="center"/>
+                        <w:textAlignment w:val="auto"/>
+                        <w:rPr/>
+                      </w:pPr>
+                      <w:r>
+                        <w:rPr>
+                          <w:rFonts w:eastAsia="楷体" w:cs="楷体" w:hint="eastAsia" w:ascii="楷体" w:hAnsi="楷体"/>
+                          <w:sz w:val="72"/>
+                          <w:szCs w:val="72"/>
+                        </w:rPr>
+                        <w:t>Li Jiaqi</w:t>
+                      </w:r>
+                    </w:p>
+                  </w:txbxContent>
+                </v:textbox>
+                <w10:wrap type="none"/>
+              </v:rect>
+            </w:pict>
+          </mc:Fallback>
+        </mc:AlternateContent>
+      </w:r>
+      <w:r>
+        <mc:AlternateContent>
+          <mc:Choice Requires="wps">
+            <w:drawing>
+              <wp:anchor distT="0" distB="0" distL="114935" distR="114935" simplePos="0" relativeHeight="10" behindDoc="0" locked="0" layoutInCell="1" allowOverlap="1">
+                <wp:simplePos x="0" y="0"/>
+                <wp:positionH relativeFrom="column">
+                  <wp:posOffset>-490220</wp:posOffset>
+                </wp:positionH>
+                <wp:positionV relativeFrom="paragraph">
+                  <wp:posOffset>22225</wp:posOffset>
+                </wp:positionV>
+                <wp:extent cx="3209290" cy="1856740"/>
+                <wp:effectExtent l="0" t="0" r="0" b="0"/>
+                <wp:wrapNone/>
+                <wp:docPr id="8" name="Frame8"/>
+                <a:graphic xmlns:a="http://schemas.openxmlformats.org/drawingml/2006/main">
+                  <a:graphicData uri="http://schemas.microsoft.com/office/word/2010/wordprocessingShape">
+                    <wps:wsp>
+                      <wps:cNvSpPr txBox="1"/>
+                      <wps:spPr>
+                        <a:xfrm>
+                          <a:off x="0" y="0"/>
+                          <a:ext cx="3209290" cy="1856740"/>
+                        </a:xfrm>
+                        <a:prstGeom prst="rect"/>
+                        <a:solidFill>
+                          <a:srgbClr val="FFFFFF"/>
+                        </a:solidFill>
+                        <a:ln w="9525">
+                          <a:solidFill>
+                            <a:srgbClr val="000000"/>
+                          </a:solidFill>
+                        </a:ln>
+                      </wps:spPr>
+                      <wps:txbx>
+                        <w:txbxContent>
+                          <w:p>
+                            <w:pPr>
+                              <w:pStyle w:val="Normal"/>
+                              <w:keepNext w:val="false"/>
+                              <w:keepLines w:val="false"/>
+                              <w:pageBreakBefore w:val="false"/>
+                              <w:widowControl w:val="false"/>
+                              <w:kinsoku w:val="true"/>
+                              <w:overflowPunct w:val="true"/>
+                              <w:autoSpaceDE w:val="true"/>
+                              <w:bidi w:val="0"/>
+                              <w:snapToGrid w:val="false"/>
+                              <w:spacing w:lineRule="atLeast" w:line="0" w:before="0" w:after="0"/>
+                              <w:jc w:val="center"/>
+                              <w:textAlignment w:val="auto"/>
+                              <w:rPr>
+                                <w:rFonts w:ascii="楷体" w:hAnsi="楷体" w:eastAsia="楷体" w:cs="楷体"/>
+                                <w:sz w:val="112"/>
+                                <w:szCs w:val="112"/>
+                              </w:rPr>
+                            </w:pPr>
+                            <w:r>
+                              <w:rPr>
+                                <w:rFonts w:ascii="楷体" w:hAnsi="楷体" w:cs="楷体" w:eastAsia="楷体"/>
+                                <w:sz w:val="112"/>
+                                <w:szCs w:val="112"/>
+                              </w:rPr>
+                              <w:t>李佳琦</w:t>
+                            </w:r>
+                          </w:p>
+                          <w:p>
+                            <w:pPr>
+                              <w:pStyle w:val="Normal"/>
+                              <w:keepNext w:val="false"/>
+                              <w:keepLines w:val="false"/>
+                              <w:pageBreakBefore w:val="false"/>
+                              <w:widowControl w:val="false"/>
+                              <w:kinsoku w:val="true"/>
+                              <w:overflowPunct w:val="true"/>
+                              <w:autoSpaceDE w:val="true"/>
+                              <w:bidi w:val="0"/>
+                              <w:snapToGrid w:val="false"/>
+                              <w:spacing w:lineRule="atLeast" w:line="0" w:before="0" w:after="0"/>
+                              <w:jc w:val="center"/>
+                              <w:textAlignment w:val="auto"/>
+                              <w:rPr/>
+                            </w:pPr>
+                            <w:r>
+                              <w:rPr>
+                                <w:rFonts w:eastAsia="楷体" w:cs="楷体" w:hint="eastAsia" w:ascii="楷体" w:hAnsi="楷体"/>
+                                <w:sz w:val="72"/>
+                                <w:szCs w:val="72"/>
+                              </w:rPr>
+                              <w:t>Li Jiaqi</w:t>
+                            </w:r>
+                          </w:p>
+                        </w:txbxContent>
+                      </wps:txbx>
+                      <wps:bodyPr anchor="t" lIns="91440" tIns="45720" rIns="91440" bIns="45720">
+                        <a:noAutofit/>
+                      </wps:bodyPr>
+                    </wps:wsp>
+                  </a:graphicData>
+                </a:graphic>
+              </wp:anchor>
+            </w:drawing>
+          </mc:Choice>
+          <mc:Fallback>
+            <w:pict>
+              <v:rect fillcolor="#FFFFFF" strokecolor="#000000" strokeweight="0pt" style="position:absolute;rotation:-0;width:252.7pt;height:146.2pt;mso-wrap-distance-left:9.05pt;mso-wrap-distance-right:9.05pt;mso-wrap-distance-top:0pt;mso-wrap-distance-bottom:0pt;margin-top:1.75pt;mso-position-vertical-relative:text;margin-left:-38.6pt;mso-position-horizontal-relative:text">
+                <v:textbox>
+                  <w:txbxContent>
+                    <w:p>
+                      <w:pPr>
+                        <w:pStyle w:val="Normal"/>
+                        <w:keepNext w:val="false"/>
+                        <w:keepLines w:val="false"/>
+                        <w:pageBreakBefore w:val="false"/>
+                        <w:widowControl w:val="false"/>
+                        <w:kinsoku w:val="true"/>
+                        <w:overflowPunct w:val="true"/>
+                        <w:autoSpaceDE w:val="true"/>
+                        <w:bidi w:val="0"/>
+                        <w:snapToGrid w:val="false"/>
+                        <w:spacing w:lineRule="atLeast" w:line="0" w:before="0" w:after="0"/>
+                        <w:jc w:val="center"/>
+                        <w:textAlignment w:val="auto"/>
+                        <w:rPr>
+                          <w:rFonts w:ascii="楷体" w:hAnsi="楷体" w:eastAsia="楷体" w:cs="楷体"/>
+                          <w:sz w:val="112"/>
+                          <w:szCs w:val="112"/>
+                        </w:rPr>
+                      </w:pPr>
+                      <w:r>
+                        <w:rPr>
+                          <w:rFonts w:ascii="楷体" w:hAnsi="楷体" w:cs="楷体" w:eastAsia="楷体"/>
+                          <w:sz w:val="112"/>
+                          <w:szCs w:val="112"/>
+                        </w:rPr>
+                        <w:t>李佳琦</w:t>
+                      </w:r>
+                    </w:p>
+                    <w:p>
+                      <w:pPr>
+                        <w:pStyle w:val="Normal"/>
+                        <w:keepNext w:val="false"/>
+                        <w:keepLines w:val="false"/>
+                        <w:pageBreakBefore w:val="false"/>
+                        <w:widowControl w:val="false"/>
+                        <w:kinsoku w:val="true"/>
+                        <w:overflowPunct w:val="true"/>
+                        <w:autoSpaceDE w:val="true"/>
+                        <w:bidi w:val="0"/>
+                        <w:snapToGrid w:val="false"/>
+                        <w:spacing w:lineRule="atLeast" w:line="0" w:before="0" w:after="0"/>
+                        <w:jc w:val="center"/>
+                        <w:textAlignment w:val="auto"/>
+                        <w:rPr/>
+                      </w:pPr>
+                      <w:r>
+                        <w:rPr>
+                          <w:rFonts w:eastAsia="楷体" w:cs="楷体" w:hint="eastAsia" w:ascii="楷体" w:hAnsi="楷体"/>
+                          <w:sz w:val="72"/>
+                          <w:szCs w:val="72"/>
+                        </w:rPr>
+                        <w:t>Li Jiaqi</w:t>
                       </w:r>
                     </w:p>
                   </w:txbxContent>

</xml_diff>